<commit_message>
docs: integrate detailed geolocation fallback and offline cache explanations in 3.3
</commit_message>
<xml_diff>
--- a/documentacion/3.3_ServiControl_desde_base_de_datos_final.docx
+++ b/documentacion/3.3_ServiControl_desde_base_de_datos_final.docx
@@ -2621,7 +2621,7 @@
           <w:rFonts w:ascii="Arial" w:hAnsi="Arial"/>
           <w:sz w:val="24"/>
         </w:rPr>
-        <w:t>Como diagnóstico previo a la mejora, se detecta que cuando el GPS del dispositivo móvil tardaba en devolver coordenadas debido a obstrucciones en exteriores o si el operario denegaba los permisos del sensor, la aplicación no lograba progresar con el inicio o cierre de la orden, provocando una detención silenciosa de la interfaz sin ofrecer instrucciones claras al usuario.</w:t>
+        <w:t>Como diagnóstico previo a la mejora, se detecta que cuando el GPS del dispositivo móvil tarda en devolver coordenadas debido a obstrucciones en exteriores o si el operario deniega los permisos del sensor, la aplicación no logra progresar con el inicio o cierre de la orden, provocando una detención silenciosa de la interfaz sin ofrecer instrucciones claras al usuario.</w:t>
       </w:r>
     </w:p>
     <w:p>
@@ -2635,7 +2635,21 @@
           <w:rFonts w:ascii="Arial" w:hAnsi="Arial"/>
           <w:sz w:val="24"/>
         </w:rPr>
-        <w:t>Para solventar esta situación, se introduce una rutina estructurada de captura de ubicación con manejo asíncrono de excepciones en el componente de detalle de la orden. Si el receptor del GPS falla o se agota el tiempo de espera preestablecido, el sistema intercepta el error y despliega un panel emergente explicativo que asiste al operario para activar los permisos o encender el sensor de geolocalización de su dispositivo. Asimismo, se incorpora una tolerancia que disminuye la precisión requerida (activando el rastreo mediante redes inalámbricas o celdas móviles) para evitar el bloqueo del expediente de servicio.</w:t>
+        <w:t>Para solventar esta situación, se introduce una rutina estructurada de captura de ubicación con manejo asíncrono de excepciones en el componente de detalle de la orden. Esta rutina se implementa mediante el uso adaptativo de la API Geolocation de HTML5 (navigator.geolocation) y ejecuta una llamada en cascada de dos niveles. En el primer nivel, se solicita la ubicación con máxima precisión (enableHighAccuracy habilitado en verdadero) y un tiempo límite de espera de diez segundos. Si el sensor no responde o la señal es insuficiente, la rutina intercepta de forma asíncrona la excepción y ejecuta un segundo nivel de llamada configurado con baja precisión (enableHighAccuracy establecido en falso) y un tiempo límite de quince segundos, permitiendo la triangulación de la posición a través de redes inalámbricas (WiFi) o celdas de telefonía móvil.</w:t>
+      </w:r>
+    </w:p>
+    <w:p>
+      <w:pPr>
+        <w:spacing w:line="360" w:lineRule="auto" w:before="0" w:after="120"/>
+        <w:ind w:left="0" w:firstLine="0"/>
+        <w:jc w:val="both"/>
+      </w:pPr>
+      <w:r>
+        <w:rPr>
+          <w:rFonts w:ascii="Arial" w:hAnsi="Arial"/>
+          <w:sz w:val="24"/>
+        </w:rPr>
+        <w:t>Asimismo, si ambos niveles de consulta fallan, el sistema intercepta el código de error retornado por la interfaz de geoposicionamiento (distinguiendo entre permisos denegados, sensor inactivo o de tiempo de espera agotado) y despliega un panel emergente interactivo de advertencia que asiste de forma visual al operario sobre cómo solucionar el incidente en su dispositivo, detallando una lista estructurada de instrucciones específicas para habilitar el GPS o modificar los permisos del navegador.</w:t>
       </w:r>
     </w:p>
     <w:p>
@@ -2650,6 +2664,62 @@
           <w:sz w:val="24"/>
         </w:rPr>
         <w:t>En la comparación de usabilidad, se determina que en el diseño original, el usuario carece de retroalimentación ante fallos del sensor, lo que resulta en pantallas congeladas. Con la implementación del mecanismo de contingencia, el sistema despliega mensajes dinámicos con instrucciones paso a paso, logrando una tasa de recuperación del cien por ciento frente a incidentes menores de geoposicionamiento.</w:t>
+      </w:r>
+    </w:p>
+    <w:p>
+      <w:pPr>
+        <w:spacing w:line="360" w:lineRule="auto" w:before="0" w:after="120"/>
+        <w:ind w:left="0" w:firstLine="0"/>
+        <w:jc w:val="both"/>
+      </w:pPr>
+      <w:r>
+        <w:rPr>
+          <w:rFonts w:ascii="Arial" w:hAnsi="Arial"/>
+          <w:sz w:val="24"/>
+        </w:rPr>
+        <w:t>Mejora 3: Almacenamiento en caché local y modo sin conexión robusto</w:t>
+      </w:r>
+    </w:p>
+    <w:p>
+      <w:pPr>
+        <w:spacing w:line="360" w:lineRule="auto" w:before="0" w:after="120"/>
+        <w:ind w:left="0" w:firstLine="0"/>
+        <w:jc w:val="both"/>
+      </w:pPr>
+      <w:r>
+        <w:rPr>
+          <w:rFonts w:ascii="Arial" w:hAnsi="Arial"/>
+          <w:sz w:val="24"/>
+        </w:rPr>
+        <w:t>Como diagnóstico previo a la mejora, se comprueba que al desconectar el acceso a internet del dispositivo móvil durante las pruebas offline, la aplicación carga la estructura de la interfaz pero despliega errores crudos de JavaScript (como TypeError: Failed to fetch) en lugar del tablero de órdenes de servicio, interrumpiendo el flujo operativo y degradando la experiencia de usuario en campo.</w:t>
+      </w:r>
+    </w:p>
+    <w:p>
+      <w:pPr>
+        <w:spacing w:line="360" w:lineRule="auto" w:before="0" w:after="120"/>
+        <w:ind w:left="0" w:firstLine="0"/>
+        <w:jc w:val="both"/>
+      </w:pPr>
+      <w:r>
+        <w:rPr>
+          <w:rFonts w:ascii="Arial" w:hAnsi="Arial"/>
+          <w:sz w:val="24"/>
+        </w:rPr>
+        <w:t>Para solucionar este inconveniente, se implementa una rutina de almacenamiento en caché local mediante la API del almacenamiento local (localStorage) del navegador en el componente del panel técnico. Cuando el dispositivo cuenta con conexión a internet, la aplicación realiza la consulta a la base de datos de Supabase y guarda de forma automática una copia estructurada de las órdenes de servicio asignadas en el almacenamiento de memoria local asociada al identificador del usuario.</w:t>
+      </w:r>
+    </w:p>
+    <w:p>
+      <w:pPr>
+        <w:spacing w:line="360" w:lineRule="auto" w:before="0" w:after="120"/>
+        <w:ind w:left="0" w:firstLine="0"/>
+        <w:jc w:val="both"/>
+      </w:pPr>
+      <w:r>
+        <w:rPr>
+          <w:rFonts w:ascii="Arial" w:hAnsi="Arial"/>
+          <w:sz w:val="24"/>
+        </w:rPr>
+        <w:t>Al interrumpirse la conectividad de red, el sistema intercepta la excepción del fallo de red, recupera los registros previamente guardados en la caché de la memoria local y los renderiza en pantalla para permitir la consulta offline de datos de trabajo. De igual forma, se reemplaza el error crudo del sistema de base de datos por un banner de alerta amigable con colores de advertencia (código de color ámbar) que informa al usuario que se encuentra operando en modo sin conexión con datos locales precargados.</w:t>
       </w:r>
     </w:p>
     <w:sectPr>

</xml_diff>